<commit_message>
Simplify WCL figures and deliver current five-method 13dB examples
</commit_message>
<xml_diff>
--- a/paper/wcl_revision_20261021_v1/outline.docx
+++ b/paper/wcl_revision_20261021_v1/outline.docx
@@ -19,7 +19,7 @@
     </w:p>
     <w:p>
       <w:r>
-        <w:t>本稿给出段落任务和内容要点，尚未扩写完整论文。主证据沿用已公开冻结版本；本轮唯一新增实验为已完成的 ARPC 解码敏感性。其结果单列，未替换 common500 主曲线。</w:t>
+        <w:t>本稿给出段落任务和内容要点，尚未扩写完整论文。主证据沿用已公开冻结版本；ARPC 解码敏感性已经完成。另完成原四张 development 图的当前五方法13 dB候选核查，独立交付，不替换正文10 dB样例。其结果单列，未替换 common500 主曲线。</w:t>
       </w:r>
     </w:p>
     <w:p>
@@ -119,7 +119,7 @@
       <w:r>
         <w:drawing>
           <wp:inline xmlns:a="http://schemas.openxmlformats.org/drawingml/2006/main" xmlns:pic="http://schemas.openxmlformats.org/drawingml/2006/picture">
-            <wp:extent cx="6547104" cy="3579876"/>
+            <wp:extent cx="6547104" cy="2897124"/>
             <wp:docPr id="1" name="Picture 1"/>
             <wp:cNvGraphicFramePr>
               <a:graphicFrameLocks noChangeAspect="1"/>
@@ -140,7 +140,7 @@
                   <pic:spPr>
                     <a:xfrm>
                       <a:off x="0" y="0"/>
-                      <a:ext cx="6547104" cy="3579876"/>
+                      <a:ext cx="6547104" cy="2897124"/>
                     </a:xfrm>
                     <a:prstGeom prst="rect"/>
                   </pic:spPr>
@@ -157,7 +157,7 @@
         <w:spacing w:after="140"/>
       </w:pPr>
       <w:r>
-        <w:t>Fig.1. 从用户确认的系统图源文件重排。主链路保留 AWGN；接收端区分已传 token 的熵解码和未传表示的生成。10 dB 的熵码流容量利用率与 Table I 同定义。</w:t>
+        <w:t>Fig.1. 从用户确认的系统图源文件重排。主链路保留 AWGN；接收端区分已传 token 的熵解码和未传表示的生成。利用率条移至 Table I；保留原图像、多尺度网格与预测—覆盖—推进示意。</w:t>
       </w:r>
     </w:p>
     <w:p>
@@ -192,13 +192,7 @@
     </w:p>
     <w:p>
       <w:r>
-        <w:rPr>
-          <w:b/>
-        </w:rPr>
-        <w:t>机制解释。</w:t>
-      </w:r>
-      <w:r>
-        <w:t>容量利用率定义为 Lterm/(k−13−16)，不是 token 数比例，也不是每符号频谱效率。10 dB 的 WHOLE 77.70%、PARTIAL 95.21% 与 Fig.1 和 Table I 同源同定义。</w:t>
+        <w:t>机制解释。容量利用率定义为 Lterm/(k−13−16)，不是 token 数比例，也不是每符号频谱效率。10 dB 的 WHOLE 77.70%、PARTIAL 95.21% 仅在 Table I 报告；Fig.1 不再放置利用率条。</w:t>
       </w:r>
     </w:p>
     <w:p>
@@ -374,7 +368,7 @@
       <w:r>
         <w:drawing>
           <wp:inline xmlns:a="http://schemas.openxmlformats.org/drawingml/2006/main" xmlns:pic="http://schemas.openxmlformats.org/drawingml/2006/picture">
-            <wp:extent cx="6547104" cy="4607052"/>
+            <wp:extent cx="6547104" cy="2743200"/>
             <wp:docPr id="3" name="Picture 3"/>
             <wp:cNvGraphicFramePr>
               <a:graphicFrameLocks noChangeAspect="1"/>
@@ -395,7 +389,7 @@
                   <pic:spPr>
                     <a:xfrm>
                       <a:off x="0" y="0"/>
-                      <a:ext cx="6547104" cy="4607052"/>
+                      <a:ext cx="6547104" cy="2743200"/>
                     </a:xfrm>
                     <a:prstGeom prst="rect"/>
                   </pic:spPr>
@@ -412,18 +406,12 @@
         <w:spacing w:after="140"/>
       </w:pPr>
       <w:r>
-        <w:t>Fig.3. 既有 development 展示：Pastries95 与 Shopping cart75，N1024、10 dB。各行使用相同 ROI 和2.667倍相对放大；标注为整幅 PSNR (dB) / LPIPS-Alex，使用实际该次重建的原生浮点分数。</w:t>
+        <w:t>Fig.3. 既有 development 展示：Pastries95 与 Shopping cart75，N1024、10 dB。两行均保留完整视野，无 ROI 方框与局部图；标注为整幅 PSNR (dB) / LPIPS-Alex，使用实际该次重建的原生浮点分数。</w:t>
       </w:r>
     </w:p>
     <w:p>
       <w:r>
-        <w:rPr>
-          <w:b/>
-        </w:rPr>
-        <w:t>段落 2：可视化。</w:t>
-      </w:r>
-      <w:r>
-        <w:t>引用 Fig.3 的 Pastries95 与 Shopping cart75，描述实际可见的糕点轮廓、表面纹理、购物车网格与把手等；使用统一 ROI 比较局部细节，同时保留完整视野。明确两个案例是既有选定 development 示例，不外推总体优劣。</w:t>
+        <w:t>段落 2：可视化。引用 Fig.3 的 Pastries95 与 Shopping cart75，描述实际可见的糕点轮廓、表面纹理、购物车网格与把手等；以完整视野比较布局、轮廓和细节，不增加局部放大行。明确两个案例是既有选定 development 示例，不外推总体优劣。</w:t>
       </w:r>
     </w:p>
     <w:p>
@@ -2513,7 +2501,7 @@
     </w:p>
     <w:p>
       <w:r>
-        <w:t>已完成：三图三表、中文大纲、Word与LaTeX骨架，以及全部预定 ARPC 敏感性设置。原采样900逻辑帧复用；新生成592个独特结果，覆盖1800逻辑帧；无新信道、无训练、无新增bootstrap索引。</w:t>
+        <w:t>已完成：三图三表、中文大纲、Word与LaTeX骨架。此前 ARPC 敏感性已闭合，本轮未重跑。另行完成四张既有 development 图的13 dB检查：20个逻辑事件，12张数字方法重建精确复用，8张连续方法重建新增；未训练或新增bootstrap。正文仍使用10 dB两张全图。</w:t>
       </w:r>
     </w:p>
     <w:p>

</xml_diff>

<commit_message>
Replace Fig3 shopping cart with fixed white dog example
</commit_message>
<xml_diff>
--- a/paper/wcl_revision_20261021_v1/outline.docx
+++ b/paper/wcl_revision_20261021_v1/outline.docx
@@ -406,12 +406,12 @@
         <w:spacing w:after="140"/>
       </w:pPr>
       <w:r>
-        <w:t>Fig.3. 既有 development 展示：Pastries95 与 Shopping cart75，N1024、10 dB。两行均保留完整视野，无 ROI 方框与局部图；标注为整幅 LPIPS-Alex / DreamSim（均越低越好），使用实际该次重建的原生浮点分数。 LPIPS沿用原值；DreamSim按主评测冻结ensemble、FP32与224像素浮点预处理补分。</w:t>
+        <w:t>Fig.3. 既有 development 展示：Pastries95 与 White long-haired dog21，N1024、10 dB。两行均保留完整视野，无 ROI 方框与局部图；标注为整幅 LPIPS-Alex / DreamSim（均越低越好），使用实际该次重建的原生浮点分数。 LPIPS沿用原值；DreamSim按主评测冻结ensemble、FP32与224像素浮点预处理补分。</w:t>
       </w:r>
     </w:p>
     <w:p>
       <w:r>
-        <w:t>段落 2：可视化。引用 Fig.3 的 Pastries95 与 Shopping cart75，描述实际可见的糕点轮廓、表面纹理、购物车网格与把手等；以完整视野比较布局、轮廓和细节，不增加局部放大行。明确两个案例是既有选定 development 示例，不外推总体优劣。</w:t>
+        <w:t>段落 2：可视化。引用 Fig.3 的 Pastries95 与 White long-haired dog21，描述实际可见的糕点轮廓、表面纹理、白色长毛狗的轮廓与毛发等；以完整视野比较布局、轮廓和细节，不增加局部放大行。明确两个案例是既有选定 development 示例，不外推总体优劣。</w:t>
       </w:r>
     </w:p>
     <w:p>

</xml_diff>

<commit_message>
Finalize Fig3 row labels and concise qualitative caption
</commit_message>
<xml_diff>
--- a/paper/wcl_revision_20261021_v1/outline.docx
+++ b/paper/wcl_revision_20261021_v1/outline.docx
@@ -265,7 +265,7 @@
         <w:t>段落 2：评价与统计。</w:t>
       </w:r>
       <w:r>
-        <w:t>PSNR、LPIPS-Alex、DreamSim、CLIP-I；CLIP-I 是 OpenAI CLIP ViT-L/14 的图像—图像余弦，224 输入、冻结浮点预处理、FP32，不做 softmax 或百分比变换。三次原噪声先按每源平均，500 源等权；点位 CI 沿用既有 source-bootstrap。差异读直接来源配对 CI；历史方法噪声命名空间不同。</w:t>
+        <w:t>PSNR、LPIPS-Alex、DreamSim、CLIP-I；CLIP-I 是 OpenAI CLIP ViT-L/14 的图像—图像余弦，224 输入、冻结浮点预处理、FP32，不做 softmax 或百分比变换。三次原噪声先按每源平均，500 源等权；点位 CI 沿用既有 source-bootstrap。差异读直接来源配对 CI；历史方法噪声命名空间不同。 DreamSim 使用冻结的 ensemble，在 FP32 下对原生浮点图像作 224×224 bicubic-antialias 预处理；LPIPS 使用 AlexNet。</w:t>
       </w:r>
     </w:p>
     <w:p>
@@ -406,12 +406,18 @@
         <w:spacing w:after="140"/>
       </w:pPr>
       <w:r>
-        <w:t>Fig.3. 既有 development 展示：Pastries95 与 White long-haired dog21，N1024、10 dB。两行均保留完整视野，无 ROI 方框与局部图；标注为整幅 LPIPS-Alex / DreamSim（均越低越好），使用实际该次重建的原生浮点分数。 LPIPS沿用原值；DreamSim按主评测冻结ensemble、FP32与224像素浮点预处理补分。</w:t>
+        <w:t>Fig. 3. Qualitative reconstructions at N=1024 complex symbols per image and an SNR of 10 dB: (a) pastries and (b) a dog. Values below each reconstruction denote LPIPS↓ / DreamSim↓ for the displayed realization.</w:t>
       </w:r>
     </w:p>
     <w:p>
       <w:r>
-        <w:t>段落 2：可视化。引用 Fig.3 的 Pastries95 与 White long-haired dog21，描述实际可见的糕点轮廓、表面纹理、白色长毛狗的轮廓与毛发等；以完整视野比较布局、轮廓和细节，不增加局部放大行。明确两个案例是既有选定 development 示例，不外推总体优劣。</w:t>
+        <w:rPr>
+          <w:b/>
+        </w:rPr>
+        <w:t>段落 2：可视化。</w:t>
+      </w:r>
+      <w:r>
+        <w:t>Fig.3(a) 中，NeST-Com 和 Latent JSCC 保留了糕点的排列与弧形轮廓，NeST-Com 的糕点褶皱更清楚。Fig.3(b) 中，两者都保留了狗坐立的轮廓，NeST-Com 的面部与毛发细节更清晰。SwinJSCC 的细节较平滑，BPG + LDPC 出现块状伪影；ARPC + LDPC 呈现较细的纹理，但物体形状或外观存在可见变化。这两个选定的 development 案例用于展示重建差异，不代表总体性能结论。</w:t>
       </w:r>
     </w:p>
     <w:p>

</xml_diff>